<commit_message>
feat(contratos): CPCV v3.1 — Quadra F privada como reserva de preservação: espaço exclusivo só em área aberta, fora da APP e sem desmatar, só estruturas removíveis (sem casa/chalé); nova Cl. 15.3 com flora e fauna intactas e córrego só para lazer de baixo impacto (v1.68.1)
Co-Authored-By: Claude Opus 5.5 <noreply@anthropic.com>
Claude-Session: https://claude.ai/code/session_011ShpVx7izhCLGMs5oHprxh
</commit_message>
<xml_diff>
--- a/templates/MODELO-CPCV-BOM-JARDIMS-v3.docx
+++ b/templates/MODELO-CPCV-BOM-JARDIMS-v3.docx
@@ -3963,7 +3963,7 @@
           <w:rFonts w:ascii="Times New Roman" w:hAnsi="Times New Roman"/>
           <w:b w:val="0"/>
         </w:rPr>
-        <w:t xml:space="preserve"> Na área de vivência (Quadra F), fora da Área de Preservação Permanente, será destinado a cada chácara um espaço de uso exclusivo de </w:t>
+        <w:t xml:space="preserve"> A área de vivência (Quadra F) é área privada do empreendimento, não integrante das áreas públicas doadas ao Município, e constitui reserva de preservação do condomínio (Cláusula 15.3). Nela, fora da faixa de Área de Preservação Permanente do córrego e somente em área já aberta, sem supressão de vegetação nativa, será destinado a cada chácara um espaço de uso exclusivo de </w:t>
       </w:r>
       <w:r>
         <w:rPr>
@@ -3978,7 +3978,7 @@
           <w:rFonts w:ascii="Times New Roman" w:hAnsi="Times New Roman"/>
           <w:b w:val="0"/>
         </w:rPr>
-        <w:t xml:space="preserve"> m², identificado e numerado em planta própria entregue com o Mapa de Vendas (Anexo V), vinculado à unidade e transmitido com ela. O condomínio disponibilizará em cada espaço uma tenda e uma churrasqueira. Quaisquer outras benfeitorias — cabana, banheiro, quiosque, chalé ou similar — correrão por conta exclusiva do(a) COMPRADOR(A), dependerão de aprovação prévia da administração, observarão o padrão construtivo das Diretrizes de Uso (Anexo IV) e a legislação ambiental, e não geram direito de propriedade sobre a área nem de indenização. A área continua sendo de uso comum, com destinação exclusiva à unidade.</w:t>
+        <w:t xml:space="preserve"> m², identificado e numerado em planta própria entregue com o Mapa de Vendas (Anexo V), vinculado à unidade e transmitido com ela. O condomínio disponibilizará em cada espaço uma tenda e uma churrasqueira. Outras benfeitorias limitam-se a estruturas leves e removíveis — cabana ou quiosque de madeira, sem fundação de alvenaria —, correrão por conta exclusiva do(a) COMPRADOR(A), dependerão de aprovação prévia da administração e observarão o padrão das Diretrizes de Uso (Anexo IV); banheiro, somente com sistema de esgotamento sanitário na forma da Cláusula 6.4 e a no mínimo 15,00 m do córrego. São vedadas edificações permanentes (casa, chalé ou similar), a supressão de vegetação e qualquer intervenção na Área de Preservação Permanente. As benfeitorias não geram direito de propriedade sobre a área nem de indenização; a área continua sendo de uso comum, com destinação exclusiva à unidade.</w:t>
       </w:r>
     </w:p>
     <w:p>
@@ -5764,6 +5764,32 @@
           <w:b/>
         </w:rPr>
         <w:t>A infração reiterada às restrições, após notificação com prazo para correção, sujeita o infrator às multas do Estatuto, sem prejuízo da demolição ou remoção do que for irregular e da responsabilidade civil, administrativa e penal.</w:t>
+      </w:r>
+    </w:p>
+    <w:p>
+      <w:pPr>
+        <w:jc w:val="both"/>
+      </w:pPr>
+      <w:r>
+        <w:rPr>
+          <w:rFonts w:ascii="Times New Roman" w:hAnsi="Times New Roman"/>
+          <w:b w:val="0"/>
+        </w:rPr>
+        <w:t xml:space="preserve">15.3. </w:t>
+      </w:r>
+      <w:r>
+        <w:rPr>
+          <w:rFonts w:ascii="Times New Roman" w:hAnsi="Times New Roman"/>
+          <w:b/>
+        </w:rPr>
+        <w:t xml:space="preserve">Reserva de preservação da Quadra F.</w:t>
+      </w:r>
+      <w:r>
+        <w:rPr>
+          <w:rFonts w:ascii="Times New Roman" w:hAnsi="Times New Roman"/>
+          <w:b w:val="0"/>
+        </w:rPr>
+        <w:t xml:space="preserve"> A área de vivência (Quadra F), incluída a Área de Preservação Permanente do córrego, é destinada à preservação da flora e da fauna nativas e ao lazer de baixo impacto, constituindo restrição convencional averbada nas matrículas e oponível a todos os sucessores. Nela são proibidos: (a) desmatar, cortar, podar de forma drástica ou danificar árvores e demais vegetação nativa, ou impedir sua regeneração; (b) caçar, capturar, perseguir ou molestar animais silvestres, soltar animais e retirar plantas, sementes ou minerais; (c) pescar de forma predatória ou com redes, explosivos ou substâncias tóxicas; (d) fazer fogo fora das churrasqueiras disponibilizadas pelo condomínio, que manterão aceiro ao redor; (e) usar sabão, xampu ou qualquer produto no córrego, lançar lixo, efluentes ou resíduos e alterar o leito ou as margens; (f) abrir novas trilhas, acessos ou clareiras sem autorização da administração e, quando exigido, do órgão ambiental; e (g) produzir som em volume que perturbe a fauna e os demais usuários, nos horários das Diretrizes de Uso. O uso do córrego limita-se ao banho e à recreação de baixo impacto, sem estruturas em suas margens além das autorizadas pelo órgão ambiental (Lei n.º 12.651/2012, arts. 3º, X, 8º e 9º). A infração sujeita o responsável às multas do Estatuto, à recomposição do dano às suas expensas e às sanções administrativas e penais (Lei n.º 9.605/1998).</w:t>
       </w:r>
     </w:p>
     <w:p>

</xml_diff>